<commit_message>
Zij koos mij: masterdocument nagekeken, ongebruikte wetten en dossier 91 in de bijlage
Co-Authored-By: Claude Opus 5.5 <noreply@anthropic.com>
Claude-Session: https://claude.ai/code/session_011xXeHb7kuJsamVtPUp8TTz
</commit_message>
<xml_diff>
--- a/tara-een-hondenleven/publicatie/bestanden/Zij_koos_mij_KDP_6x9.docx
+++ b/tara-een-hondenleven/publicatie/bestanden/Zij_koos_mij_KDP_6x9.docx
@@ -32358,15 +32358,25 @@
           <w:sz w:val="22"/>
           <w:szCs w:val="22"/>
         </w:rPr>
-        <w:t xml:space="preserve">Labradorwet nr. 45.</w:t>
-      </w:r>
-      <w:r>
-        <w:rPr>
-          <w:rFonts w:ascii="Georgia" w:cs="Georgia" w:eastAsia="Georgia" w:hAnsi="Georgia"/>
-          <w:sz w:val="22"/>
-          <w:szCs w:val="22"/>
-        </w:rPr>
-        <w:t xml:space="preserve"> Een goede onderzoeker twijfelt aan haar hypothese. Een goede hond twijfelt nooit aan haar baas. (hoofdstuk 19)</w:t>
+        <w:t xml:space="preserve">Labradorwet nr. 44.</w:t>
+      </w:r>
+      <w:r>
+        <w:rPr>
+          <w:rFonts w:ascii="Georgia" w:cs="Georgia" w:eastAsia="Georgia" w:hAnsi="Georgia"/>
+          <w:sz w:val="22"/>
+          <w:szCs w:val="22"/>
+        </w:rPr>
+        <w:t xml:space="preserve"> Als iemand zegt dat hij geen honger heeft, wacht vijf minuten. </w:t>
+      </w:r>
+      <w:r>
+        <w:rPr>
+          <w:rFonts w:ascii="Georgia" w:cs="Georgia" w:eastAsia="Georgia" w:hAnsi="Georgia"/>
+          <w:i/>
+          <w:iCs/>
+          <w:sz w:val="22"/>
+          <w:szCs w:val="22"/>
+        </w:rPr>
+        <w:t xml:space="preserve">Niet opgenomen: te vaak bevestigd om nog onderzoek te heten.</w:t>
       </w:r>
     </w:p>
     <w:p>
@@ -32391,15 +32401,15 @@
           <w:sz w:val="22"/>
           <w:szCs w:val="22"/>
         </w:rPr>
-        <w:t xml:space="preserve">Labradorwet nr. 47.</w:t>
-      </w:r>
-      <w:r>
-        <w:rPr>
-          <w:rFonts w:ascii="Georgia" w:cs="Georgia" w:eastAsia="Georgia" w:hAnsi="Georgia"/>
-          <w:sz w:val="22"/>
-          <w:szCs w:val="22"/>
-        </w:rPr>
-        <w:t xml:space="preserve"> Wandel elke dag, in elk weer, ook als je stijf bent. Op den duur vergeet je waarom je ooit begonnen bent. Dat is het goede moment om door te gaan. (hoofdstuk 24)</w:t>
+        <w:t xml:space="preserve">Labradorwet nr. 45.</w:t>
+      </w:r>
+      <w:r>
+        <w:rPr>
+          <w:rFonts w:ascii="Georgia" w:cs="Georgia" w:eastAsia="Georgia" w:hAnsi="Georgia"/>
+          <w:sz w:val="22"/>
+          <w:szCs w:val="22"/>
+        </w:rPr>
+        <w:t xml:space="preserve"> Een goede onderzoeker twijfelt aan haar hypothese. Een goede hond twijfelt nooit aan haar baas. (hoofdstuk 19)</w:t>
       </w:r>
     </w:p>
     <w:p>
@@ -32424,6 +32434,39 @@
           <w:sz w:val="22"/>
           <w:szCs w:val="22"/>
         </w:rPr>
+        <w:t xml:space="preserve">Labradorwet nr. 47.</w:t>
+      </w:r>
+      <w:r>
+        <w:rPr>
+          <w:rFonts w:ascii="Georgia" w:cs="Georgia" w:eastAsia="Georgia" w:hAnsi="Georgia"/>
+          <w:sz w:val="22"/>
+          <w:szCs w:val="22"/>
+        </w:rPr>
+        <w:t xml:space="preserve"> Wandel elke dag, in elk weer, ook als je stijf bent. Op den duur vergeet je waarom je ooit begonnen bent. Dat is het goede moment om door te gaan. (hoofdstuk 24)</w:t>
+      </w:r>
+    </w:p>
+    <w:p>
+      <w:pPr>
+        <w:spacing w:after="80" w:line="276"/>
+        <w:ind w:left="540" w:hanging="270"/>
+        <w:jc w:val="left"/>
+      </w:pPr>
+      <w:r>
+        <w:rPr>
+          <w:rFonts w:ascii="Georgia" w:cs="Georgia" w:eastAsia="Georgia" w:hAnsi="Georgia"/>
+          <w:sz w:val="22"/>
+          <w:szCs w:val="22"/>
+        </w:rPr>
+        <w:t xml:space="preserve">•	</w:t>
+      </w:r>
+      <w:r>
+        <w:rPr>
+          <w:rFonts w:ascii="Georgia" w:cs="Georgia" w:eastAsia="Georgia" w:hAnsi="Georgia"/>
+          <w:b/>
+          <w:bCs/>
+          <w:sz w:val="22"/>
+          <w:szCs w:val="22"/>
+        </w:rPr>
         <w:t xml:space="preserve">Labradorwet nr. 52.</w:t>
       </w:r>
       <w:r>
@@ -32433,6 +32476,92 @@
           <w:szCs w:val="22"/>
         </w:rPr>
         <w:t xml:space="preserve"> Wat je niet begrijpt, mag je nog steeds liefhebben. (hoofdstuk 26)</w:t>
+      </w:r>
+    </w:p>
+    <w:p>
+      <w:pPr>
+        <w:spacing w:after="80" w:line="276"/>
+        <w:ind w:left="540" w:hanging="270"/>
+        <w:jc w:val="left"/>
+      </w:pPr>
+      <w:r>
+        <w:rPr>
+          <w:rFonts w:ascii="Georgia" w:cs="Georgia" w:eastAsia="Georgia" w:hAnsi="Georgia"/>
+          <w:sz w:val="22"/>
+          <w:szCs w:val="22"/>
+        </w:rPr>
+        <w:t xml:space="preserve">•	</w:t>
+      </w:r>
+      <w:r>
+        <w:rPr>
+          <w:rFonts w:ascii="Georgia" w:cs="Georgia" w:eastAsia="Georgia" w:hAnsi="Georgia"/>
+          <w:b/>
+          <w:bCs/>
+          <w:sz w:val="22"/>
+          <w:szCs w:val="22"/>
+        </w:rPr>
+        <w:t xml:space="preserve">Labradorwet nr. 57.</w:t>
+      </w:r>
+      <w:r>
+        <w:rPr>
+          <w:rFonts w:ascii="Georgia" w:cs="Georgia" w:eastAsia="Georgia" w:hAnsi="Georgia"/>
+          <w:sz w:val="22"/>
+          <w:szCs w:val="22"/>
+        </w:rPr>
+        <w:t xml:space="preserve"> Verdriet wordt lichter wanneer je ernaast gaat liggen. </w:t>
+      </w:r>
+      <w:r>
+        <w:rPr>
+          <w:rFonts w:ascii="Georgia" w:cs="Georgia" w:eastAsia="Georgia" w:hAnsi="Georgia"/>
+          <w:i/>
+          <w:iCs/>
+          <w:sz w:val="22"/>
+          <w:szCs w:val="22"/>
+        </w:rPr>
+        <w:t xml:space="preserve">Niet opgenomen: de onderzoeker deed het liever dan het op te schrijven.</w:t>
+      </w:r>
+    </w:p>
+    <w:p>
+      <w:pPr>
+        <w:spacing w:after="80" w:line="276"/>
+        <w:ind w:left="540" w:hanging="270"/>
+        <w:jc w:val="left"/>
+      </w:pPr>
+      <w:r>
+        <w:rPr>
+          <w:rFonts w:ascii="Georgia" w:cs="Georgia" w:eastAsia="Georgia" w:hAnsi="Georgia"/>
+          <w:sz w:val="22"/>
+          <w:szCs w:val="22"/>
+        </w:rPr>
+        <w:t xml:space="preserve">•	</w:t>
+      </w:r>
+      <w:r>
+        <w:rPr>
+          <w:rFonts w:ascii="Georgia" w:cs="Georgia" w:eastAsia="Georgia" w:hAnsi="Georgia"/>
+          <w:b/>
+          <w:bCs/>
+          <w:sz w:val="22"/>
+          <w:szCs w:val="22"/>
+        </w:rPr>
+        <w:t xml:space="preserve">Labradorwet nr. 63.</w:t>
+      </w:r>
+      <w:r>
+        <w:rPr>
+          <w:rFonts w:ascii="Georgia" w:cs="Georgia" w:eastAsia="Georgia" w:hAnsi="Georgia"/>
+          <w:sz w:val="22"/>
+          <w:szCs w:val="22"/>
+        </w:rPr>
+        <w:t xml:space="preserve"> Een bal die onder de bank ligt, is niet kwijt. Hij wacht. </w:t>
+      </w:r>
+      <w:r>
+        <w:rPr>
+          <w:rFonts w:ascii="Georgia" w:cs="Georgia" w:eastAsia="Georgia" w:hAnsi="Georgia"/>
+          <w:i/>
+          <w:iCs/>
+          <w:sz w:val="22"/>
+          <w:szCs w:val="22"/>
+        </w:rPr>
+        <w:t xml:space="preserve">Niet opgenomen.</w:t>
       </w:r>
     </w:p>
     <w:p>
@@ -32942,6 +33071,49 @@
           <w:szCs w:val="22"/>
         </w:rPr>
         <w:t xml:space="preserve"> De postbode. Status: reproduceerbaar gevaar. (hoofdstuk 16)</w:t>
+      </w:r>
+    </w:p>
+    <w:p>
+      <w:pPr>
+        <w:spacing w:after="80" w:line="276"/>
+        <w:ind w:left="540" w:hanging="270"/>
+        <w:jc w:val="left"/>
+      </w:pPr>
+      <w:r>
+        <w:rPr>
+          <w:rFonts w:ascii="Georgia" w:cs="Georgia" w:eastAsia="Georgia" w:hAnsi="Georgia"/>
+          <w:sz w:val="22"/>
+          <w:szCs w:val="22"/>
+        </w:rPr>
+        <w:t xml:space="preserve">•	</w:t>
+      </w:r>
+      <w:r>
+        <w:rPr>
+          <w:rFonts w:ascii="Georgia" w:cs="Georgia" w:eastAsia="Georgia" w:hAnsi="Georgia"/>
+          <w:b/>
+          <w:bCs/>
+          <w:sz w:val="22"/>
+          <w:szCs w:val="22"/>
+        </w:rPr>
+        <w:t xml:space="preserve">Dossier 91.</w:t>
+      </w:r>
+      <w:r>
+        <w:rPr>
+          <w:rFonts w:ascii="Georgia" w:cs="Georgia" w:eastAsia="Georgia" w:hAnsi="Georgia"/>
+          <w:sz w:val="22"/>
+          <w:szCs w:val="22"/>
+        </w:rPr>
+        <w:t xml:space="preserve"> De koelkast. Waarneming: de proefpersoon opent de koelkast, kijkt erin, sluit hem, en opent hem kort daarna opnieuw. Status: mogelijk een opslagplaats van hoop. </w:t>
+      </w:r>
+      <w:r>
+        <w:rPr>
+          <w:rFonts w:ascii="Georgia" w:cs="Georgia" w:eastAsia="Georgia" w:hAnsi="Georgia"/>
+          <w:i/>
+          <w:iCs/>
+          <w:sz w:val="22"/>
+          <w:szCs w:val="22"/>
+        </w:rPr>
+        <w:t xml:space="preserve">Niet opgenomen.</w:t>
       </w:r>
     </w:p>
     <w:p>

</xml_diff>